<commit_message>
update new service quangha
</commit_message>
<xml_diff>
--- a/desktop_app/backend/documents/ownership_confirmation/00_MAU_GIAY_CAM_KET_XAC_NHAN_QUYEN.docx
+++ b/desktop_app/backend/documents/ownership_confirmation/00_MAU_GIAY_CAM_KET_XAC_NHAN_QUYEN.docx
@@ -729,7 +729,15 @@
               <w:end w:w="65" w:type="dxa"/>
             </w:tcMar>
           </w:tcPr>
-          <w:p/>
+          <w:p>
+            <w:r>
+              <w:rPr>
+                <w:rFonts w:ascii="JetBrainsMono NF ExtraBold" w:hAnsi="JetBrainsMono NF ExtraBold" w:eastAsia="JetBrainsMono NF ExtraBold" w:cs="JetBrainsMono NF ExtraBold"/>
+                <w:b w:val="0"/>
+                <w:sz w:val="24"/>
+              </w:rPr>
+            </w:r>
+          </w:p>
         </w:tc>
         <w:tc>
           <w:tcPr>
@@ -741,7 +749,15 @@
               <w:end w:w="65" w:type="dxa"/>
             </w:tcMar>
           </w:tcPr>
-          <w:p/>
+          <w:p>
+            <w:r>
+              <w:rPr>
+                <w:rFonts w:ascii="JetBrainsMono NF ExtraBold" w:hAnsi="JetBrainsMono NF ExtraBold" w:eastAsia="JetBrainsMono NF ExtraBold" w:cs="JetBrainsMono NF ExtraBold"/>
+                <w:b w:val="0"/>
+                <w:sz w:val="24"/>
+              </w:rPr>
+            </w:r>
+          </w:p>
         </w:tc>
         <w:tc>
           <w:tcPr>
@@ -753,7 +769,15 @@
               <w:end w:w="65" w:type="dxa"/>
             </w:tcMar>
           </w:tcPr>
-          <w:p/>
+          <w:p>
+            <w:r>
+              <w:rPr>
+                <w:rFonts w:ascii="JetBrainsMono NF ExtraBold" w:hAnsi="JetBrainsMono NF ExtraBold" w:eastAsia="JetBrainsMono NF ExtraBold" w:cs="JetBrainsMono NF ExtraBold"/>
+                <w:b w:val="0"/>
+                <w:sz w:val="24"/>
+              </w:rPr>
+            </w:r>
+          </w:p>
         </w:tc>
         <w:tc>
           <w:tcPr>
@@ -765,7 +789,15 @@
               <w:end w:w="65" w:type="dxa"/>
             </w:tcMar>
           </w:tcPr>
-          <w:p/>
+          <w:p>
+            <w:r>
+              <w:rPr>
+                <w:rFonts w:ascii="JetBrainsMono NF ExtraBold" w:hAnsi="JetBrainsMono NF ExtraBold" w:eastAsia="JetBrainsMono NF ExtraBold" w:cs="JetBrainsMono NF ExtraBold"/>
+                <w:b w:val="0"/>
+                <w:sz w:val="24"/>
+              </w:rPr>
+            </w:r>
+          </w:p>
         </w:tc>
       </w:tr>
     </w:tbl>

</xml_diff>